<commit_message>
weekly: W17 Context保卫战 — 结构优化
- 第五节扩充判断矩阵（context特性 × 推荐策略）
- 暗线（模型积累自己的context）提前到Executive Summary
- Prediction Review加信心变化指示（↑/→）
- Cursor信号补充主题关联说明

Co-Authored-By: Claude Opus 4.6 <noreply@anthropic.com>
</commit_message>
<xml_diff>
--- a/data/weekly/2026-W17.docx
+++ b/data/weekly/2026-W17.docx
@@ -125,7 +125,7 @@
           <w:sz w:val="22"/>
           <w:szCs w:val="22"/>
         </w:rPr>
-        <w:t xml:space="preserve">W16讲的是Agent部署加速但评估体系跟不上。本周的信号指向一个更根本的问题：AI不只是在原有赛道上跑得更快，而是同时开辟了一批全新赛道。48小时内，Anthropic发布Claude Design挑战Figma，OpenAI将Codex升级为计算机操作员并推出生命科学模型GPT-Rosalind，Salesforce把27年的CRM平台改造为Agent基础设施。面对这种同时入侵，垂直领域的在位者只有三种应对姿态：封闭数据拒绝合作、投入资源自建模型、或者主动将自己的用户context开放为AI调用的基础设施。本周最重要的信号不是谁发布了什么产品，而是Salesforce、Shopify、SAP等在位者已经做出了选择——主动开放。它们为什么做这个选择、这个选择背后的逻辑和代价，才是本周真正值得深入分析的问题。</w:t>
+        <w:t xml:space="preserve">W16讲的是Agent部署加速但评估体系跟不上。本周的信号指向一个更根本的问题：AI不只是在原有赛道上跑得更快，而是同时开辟了一批全新赛道。48小时内，Anthropic发布Claude Design挑战Figma，OpenAI将Codex升级为计算机操作员并推出生命科学模型GPT-Rosalind，Salesforce把27年的CRM平台改造为Agent基础设施。面对这种同时入侵，垂直领域的在位者只有三种应对姿态：封闭数据拒绝合作、投入资源自建模型、或者主动将自己的用户context开放为AI调用的基础设施。本周最重要的信号不是谁发布了什么产品，而是Salesforce、Shopify、SAP等在位者已经做出了选择——主动开放。但更值得警惕的是硬币的另一面：在位者还在犹豫的时候，模型公司已经在通过持久记忆、自学习Agent和数百万用户交互疯狂积累自己的context。这场保卫战的时间窗口正在关闭。</w:t>
       </w:r>
     </w:p>
     <w:p>
@@ -525,33 +525,111 @@
           <w:sz w:val="22"/>
           <w:szCs w:val="22"/>
         </w:rPr>
-        <w:t xml:space="preserve">三条路的选择不完全取决于主观意愿——context的性质决定了最优策略。</w:t>
-      </w:r>
-    </w:p>
-    <w:p>
-      <w:pPr>
-        <w:spacing w:after="160"/>
-      </w:pPr>
-      <w:r>
-        <w:rPr>
-          <w:rFonts w:ascii="Arial" w:cs="Arial" w:eastAsia="Arial" w:hAnsi="Arial"/>
-          <w:sz w:val="22"/>
-          <w:szCs w:val="22"/>
-        </w:rPr>
-        <w:t xml:space="preserve">如果你的context具有强网络效应——越多人用越有价值，单个用户搬不走——开放是最有利的选择。Salesforce的客户关系数据就是这种类型：一个客户的数据和成千上万其他客户的数据交叉分析后才最有价值，单独搬走一份意义有限。Shopify的数十亿SKU商品目录也是如此：规模本身就是壁垒。</w:t>
-      </w:r>
-    </w:p>
-    <w:p>
-      <w:pPr>
-        <w:spacing w:after="160"/>
-      </w:pPr>
-      <w:r>
-        <w:rPr>
-          <w:rFonts w:ascii="Arial" w:cs="Arial" w:eastAsia="Arial" w:hAnsi="Arial"/>
-          <w:sz w:val="22"/>
-          <w:szCs w:val="22"/>
-        </w:rPr>
-        <w:t xml:space="preserve">如果你的context是用户可以在AI原生平台上快速重建的——比如个人笔记、简单的项目管理——那无论选哪条路都很难持久。这类产品面对的不是"选哪条路"的问题，而是"窗口期有多短"的问题。吴恩达本周说，AI Agent加速编码后，软件工程的瓶颈从"怎么造"转移到了"造什么"。这个判断可以推广到所有被AI进入的领域：当AI能执行专业任务时，价值就从执行能力转移到判断力。对在位者来说，最持久的context不是"怎么做"的操作记录，而是"为什么这么做"的决策历史和关系网络。前者AI可以学会，后者需要时间积累、难以复制。</w:t>
+        <w:t xml:space="preserve">三条路的选择不完全取决于主观意愿——context的性质决定了最优策略。可以从两个维度来判断：context是否具有网络效应（越多人用越有价值，单个用户搬不走），以及context是否可被用户在AI原生平台上快速重建。</w:t>
+      </w:r>
+    </w:p>
+    <w:p>
+      <w:pPr>
+        <w:spacing w:after="60"/>
+        <w:ind w:left="360"/>
+      </w:pPr>
+      <w:r>
+        <w:rPr>
+          <w:rFonts w:ascii="Arial" w:cs="Arial" w:eastAsia="Arial" w:hAnsi="Arial"/>
+          <w:color w:val="333333"/>
+          <w:sz w:val="20"/>
+          <w:szCs w:val="20"/>
+        </w:rPr>
+        <w:t xml:space="preserve">Context特性  |  典型案例  |  推荐策略  |  核心逻辑</w:t>
+      </w:r>
+    </w:p>
+    <w:p>
+      <w:pPr>
+        <w:spacing w:after="60"/>
+        <w:ind w:left="360"/>
+      </w:pPr>
+      <w:r>
+        <w:rPr>
+          <w:rFonts w:ascii="Arial" w:cs="Arial" w:eastAsia="Arial" w:hAnsi="Arial"/>
+          <w:color w:val="333333"/>
+          <w:sz w:val="20"/>
+          <w:szCs w:val="20"/>
+        </w:rPr>
+        <w:t xml:space="preserve">强网络效应，不可搬走  |  Salesforce CRM数据、Shopify数十亿SKU目录  |  主动开放  |  规模本身是壁垒，开放让context在AI工作流中更值钱</w:t>
+      </w:r>
+    </w:p>
+    <w:p>
+      <w:pPr>
+        <w:spacing w:after="60"/>
+        <w:ind w:left="360"/>
+      </w:pPr>
+      <w:r>
+        <w:rPr>
+          <w:rFonts w:ascii="Arial" w:cs="Arial" w:eastAsia="Arial" w:hAnsi="Arial"/>
+          <w:color w:val="333333"/>
+          <w:sz w:val="20"/>
+          <w:szCs w:val="20"/>
+        </w:rPr>
+        <w:t xml:space="preserve">独占监管数据，高合规门槛  |  药企临床试验数据、金融交易数据  |  选择性合作  |  数据受监管保护不可复制，合作比自建更高效（如Amgen + GPT-Rosalind）</w:t>
+      </w:r>
+    </w:p>
+    <w:p>
+      <w:pPr>
+        <w:spacing w:after="60"/>
+        <w:ind w:left="360"/>
+      </w:pPr>
+      <w:r>
+        <w:rPr>
+          <w:rFonts w:ascii="Arial" w:cs="Arial" w:eastAsia="Arial" w:hAnsi="Arial"/>
+          <w:color w:val="333333"/>
+          <w:sz w:val="20"/>
+          <w:szCs w:val="20"/>
+        </w:rPr>
+        <w:t xml:space="preserve">高粘性协作网络  |  Figma设计生态、GitHub代码仓库  |  开放工具层，强化协作层  |  协作网络是AI最难替代的，开放执行能力但守住社区和工作流</w:t>
+      </w:r>
+    </w:p>
+    <w:p>
+      <w:pPr>
+        <w:spacing w:after="60"/>
+        <w:ind w:left="360"/>
+      </w:pPr>
+      <w:r>
+        <w:rPr>
+          <w:rFonts w:ascii="Arial" w:cs="Arial" w:eastAsia="Arial" w:hAnsi="Arial"/>
+          <w:color w:val="333333"/>
+          <w:sz w:val="20"/>
+          <w:szCs w:val="20"/>
+        </w:rPr>
+        <w:t xml:space="preserve">个人化、可快速重建  |  个人笔记、简单项目管理  |  加速转型或寻找出路  |  用户可在AI原生平台三天内重建，窗口期最短</w:t>
+      </w:r>
+    </w:p>
+    <w:p>
+      <w:pPr>
+        <w:spacing w:after="160"/>
+      </w:pPr>
+      <w:r>
+        <w:rPr>
+          <w:rFonts w:ascii="Arial" w:cs="Arial" w:eastAsia="Arial" w:hAnsi="Arial"/>
+          <w:sz w:val="22"/>
+          <w:szCs w:val="22"/>
+        </w:rPr>
+        <w:t xml:space="preserve">Salesforce和Shopify落在第一类：它们的context价值来自跨用户的规模聚合，开放是最优解。Amgen、Moderna落在第二类：临床数据受严格监管保护，但通过合作可以让这些数据在AI工作流中发挥更大价值，同时保持控制权。Figma可能落在第三类：它的壁垒一半是工具能力（正在被Claude Design挑战），一半是设计师的协作网络和评审流程（AI短期内难以替代）。而大量的SaaS工具落在第四类——吴恩达本周说，AI Agent加速编码后，瓶颈从"怎么造"转移到了"造什么"。当AI能执行专业任务时，价值就从执行能力转移到判断力。如果你的产品提供的主要是执行能力而非决策context，保卫战可能已经输了一半。</w:t>
+      </w:r>
+    </w:p>
+    <w:p>
+      <w:pPr>
+        <w:spacing w:after="160" w:before="280"/>
+      </w:pPr>
+      <w:r>
+        <w:rPr>
+          <w:rFonts w:ascii="Arial" w:cs="Arial" w:eastAsia="Arial" w:hAnsi="Arial"/>
+          <w:b/>
+          <w:bCs/>
+          <w:color w:val="2E75B6"/>
+          <w:sz w:val="24"/>
+          <w:szCs w:val="24"/>
+        </w:rPr>
+        <w:t xml:space="preserve">六、真正的紧迫性：模型公司在积累自己的context</w:t>
       </w:r>
     </w:p>
     <w:p>
@@ -806,7 +884,7 @@
           <w:sz w:val="22"/>
           <w:szCs w:val="22"/>
         </w:rPr>
-        <w:t xml:space="preserve"> → Scale AI CEO本周展示Muse Spark在ClawEval（Agentic任务评测）上的排名，主动引用真实任务基准而非传统benchmark。方向符合预期。⏳ 观察中。</w:t>
+        <w:t xml:space="preserve"> → Scale AI CEO本周展示Muse Spark在ClawEval（Agentic任务评测）上的排名，主动引用真实任务基准而非传统benchmark。方向符合预期，但尚未出现头部模型公司在正式发布中采用。⏳ 观察中 · 信心：较上周略升（↑）。</w:t>
       </w:r>
     </w:p>
     <w:p>
@@ -837,7 +915,7 @@
           <w:sz w:val="22"/>
           <w:szCs w:val="22"/>
         </w:rPr>
-        <w:t xml:space="preserve"> → VentureBeat调查发现大多数企业无法阻止Stage-3 Agent威胁，Microsoft Copilot Studio修补漏洞后数据仍可被窃取。需求端信号在增强，但尚未成为采购标准。⏳ 观察中。</w:t>
+        <w:t xml:space="preserve"> → VentureBeat调查发现大多数企业无法阻止Stage-3 Agent威胁，Microsoft Copilot Studio修补漏洞后数据仍可被窃取。威胁认知在增强，但距离转化为采购标准还有距离——当前更多是安全厂商在推动，甲方尚未形成统一要求。⏳ 观察中 · 信心：与上周持平（→）。</w:t>
       </w:r>
     </w:p>
     <w:p>
@@ -1082,7 +1160,7 @@
           <w:sz w:val="20"/>
           <w:szCs w:val="20"/>
         </w:rPr>
-        <w:t xml:space="preserve">Cursor洽谈以$50B估值融资$2B+  |  TechCrunch  |  ★★☆</w:t>
+        <w:t xml:space="preserve">Cursor以$50B估值融$2B+：资本押注AI将替代垂直开发工具  |  TechCrunch  |  ★★☆</w:t>
       </w:r>
     </w:p>
     <w:p>

</xml_diff>